<commit_message>
docs: link do drive na entrega, apresentacao do pitch e ignora videos
Co-authored-by: Claude <noreply@anthropic.com>
</commit_message>
<xml_diff>
--- a/docs/relatorio-projeto.docx
+++ b/docs/relatorio-projeto.docx
@@ -36,7 +36,7 @@
         </w:p>
       </w:sdtContent>
     </w:sdt>
-    <w:bookmarkStart w:id="28" w:name="confirmasus--relatório-do-projeto"/>
+    <w:bookmarkStart w:id="29" w:name="confirmasus--relatório-do-projeto"/>
     <w:p>
       <w:pPr>
         <w:pStyle w:val="Heading1"/>
@@ -3483,7 +3483,7 @@
     </w:p>
     <w:bookmarkEnd w:id="21"/>
     <w:bookmarkEnd w:id="22"/>
-    <w:bookmarkStart w:id="24" w:name="X39c3f2424e3a7da1e6bf968d81461164e1b8e55"/>
+    <w:bookmarkStart w:id="25" w:name="X39c3f2424e3a7da1e6bf968d81461164e1b8e55"/>
     <w:p>
       <w:pPr>
         <w:pStyle w:val="Heading2"/>
@@ -3672,17 +3672,22 @@
           <w:b/>
           <w:bCs/>
         </w:rPr>
-        <w:t xml:space="preserve">Links do drive com os vídeos:</w:t>
-      </w:r>
-      <w:r>
-        <w:t xml:space="preserve"> </w:t>
-      </w:r>
-      <w:r>
-        <w:t xml:space="preserve">[PREENCHER após o upload — vídeo do pitch e vídeo do MVP]</w:t>
-      </w:r>
-    </w:p>
-    <w:bookmarkEnd w:id="24"/>
-    <w:bookmarkStart w:id="27" w:name="X5b3b2c73ccb306a71857338dd5e3fcca214b410"/>
+        <w:t xml:space="preserve">Vídeos (pitch e MVP funcionando) e relatório:</w:t>
+      </w:r>
+      <w:r>
+        <w:t xml:space="preserve"> </w:t>
+      </w:r>
+      <w:hyperlink r:id="rId24">
+        <w:r>
+          <w:rPr>
+            <w:rStyle w:val="Hyperlink"/>
+          </w:rPr>
+          <w:t xml:space="preserve">https://drive.google.com/drive/folders/1Qwuls_wKPDD7x-JDzFxxjAIEbfas1GZY?usp=drive_link</w:t>
+        </w:r>
+      </w:hyperlink>
+    </w:p>
+    <w:bookmarkEnd w:id="25"/>
+    <w:bookmarkStart w:id="28" w:name="X5b3b2c73ccb306a71857338dd5e3fcca214b410"/>
     <w:p>
       <w:pPr>
         <w:pStyle w:val="Heading2"/>
@@ -3691,7 +3696,7 @@
         <w:t xml:space="preserve">7. Aprendizados e próximos passos</w:t>
       </w:r>
     </w:p>
-    <w:bookmarkStart w:id="25" w:name="aprendizados"/>
+    <w:bookmarkStart w:id="26" w:name="aprendizados"/>
     <w:p>
       <w:pPr>
         <w:pStyle w:val="Heading3"/>
@@ -3812,8 +3817,8 @@
         <w:t xml:space="preserve">) e de um frontend mínimo.</w:t>
       </w:r>
     </w:p>
-    <w:bookmarkEnd w:id="25"/>
-    <w:bookmarkStart w:id="26" w:name="próximos-passos"/>
+    <w:bookmarkEnd w:id="26"/>
+    <w:bookmarkStart w:id="27" w:name="próximos-passos"/>
     <w:p>
       <w:pPr>
         <w:pStyle w:val="Heading3"/>
@@ -4050,9 +4055,9 @@
         <w:t xml:space="preserve">para os fixes recentes.</w:t>
       </w:r>
     </w:p>
-    <w:bookmarkEnd w:id="26"/>
     <w:bookmarkEnd w:id="27"/>
     <w:bookmarkEnd w:id="28"/>
+    <w:bookmarkEnd w:id="29"/>
     <w:sectPr>
       <w:footnotePr>
         <w:numRestart w:val="eachSect"/>

</xml_diff>